<commit_message>
added week6 terraform & ansible activity
</commit_message>
<xml_diff>
--- a/Week6/Task/Task_Report_Week6.docx
+++ b/Week6/Task/Task_Report_Week6.docx
@@ -2308,6 +2308,195 @@
           <w:szCs w:val="24"/>
         </w:rPr>
       </w:pPr>
+    </w:p>
+    <w:p>
+      <w:pPr>
+        <w:pStyle w:val="ListParagraph"/>
+        <w:rPr>
+          <w:b/>
+          <w:bCs/>
+          <w:sz w:val="24"/>
+          <w:szCs w:val="24"/>
+        </w:rPr>
+      </w:pPr>
+    </w:p>
+    <w:p>
+      <w:pPr>
+        <w:pStyle w:val="ListParagraph"/>
+        <w:rPr>
+          <w:b/>
+          <w:bCs/>
+          <w:sz w:val="24"/>
+          <w:szCs w:val="24"/>
+        </w:rPr>
+      </w:pPr>
+    </w:p>
+    <w:p>
+      <w:pPr>
+        <w:pStyle w:val="ListParagraph"/>
+        <w:rPr>
+          <w:b/>
+          <w:bCs/>
+          <w:sz w:val="24"/>
+          <w:szCs w:val="24"/>
+        </w:rPr>
+      </w:pPr>
+    </w:p>
+    <w:p>
+      <w:pPr>
+        <w:pStyle w:val="ListParagraph"/>
+        <w:rPr>
+          <w:b/>
+          <w:bCs/>
+          <w:sz w:val="24"/>
+          <w:szCs w:val="24"/>
+        </w:rPr>
+      </w:pPr>
+    </w:p>
+    <w:p>
+      <w:pPr>
+        <w:pStyle w:val="ListParagraph"/>
+        <w:rPr>
+          <w:b/>
+          <w:bCs/>
+          <w:sz w:val="24"/>
+          <w:szCs w:val="24"/>
+        </w:rPr>
+      </w:pPr>
+    </w:p>
+    <w:p>
+      <w:pPr>
+        <w:pStyle w:val="ListParagraph"/>
+        <w:rPr>
+          <w:b/>
+          <w:bCs/>
+          <w:sz w:val="24"/>
+          <w:szCs w:val="24"/>
+        </w:rPr>
+      </w:pPr>
+    </w:p>
+    <w:p>
+      <w:pPr>
+        <w:pStyle w:val="ListParagraph"/>
+        <w:rPr>
+          <w:b/>
+          <w:bCs/>
+          <w:sz w:val="24"/>
+          <w:szCs w:val="24"/>
+        </w:rPr>
+      </w:pPr>
+    </w:p>
+    <w:p>
+      <w:pPr>
+        <w:pStyle w:val="ListParagraph"/>
+        <w:rPr>
+          <w:b/>
+          <w:bCs/>
+          <w:sz w:val="24"/>
+          <w:szCs w:val="24"/>
+        </w:rPr>
+      </w:pPr>
+    </w:p>
+    <w:p>
+      <w:pPr>
+        <w:pStyle w:val="ListParagraph"/>
+        <w:rPr>
+          <w:b/>
+          <w:bCs/>
+          <w:sz w:val="24"/>
+          <w:szCs w:val="24"/>
+        </w:rPr>
+      </w:pPr>
+    </w:p>
+    <w:p>
+      <w:pPr>
+        <w:pStyle w:val="ListParagraph"/>
+        <w:rPr>
+          <w:b/>
+          <w:bCs/>
+          <w:sz w:val="24"/>
+          <w:szCs w:val="24"/>
+        </w:rPr>
+      </w:pPr>
+    </w:p>
+    <w:p>
+      <w:pPr>
+        <w:pStyle w:val="ListParagraph"/>
+        <w:rPr>
+          <w:sz w:val="24"/>
+          <w:szCs w:val="24"/>
+        </w:rPr>
+      </w:pPr>
+      <w:r>
+        <w:rPr>
+          <w:b/>
+          <w:bCs/>
+          <w:sz w:val="24"/>
+          <w:szCs w:val="24"/>
+        </w:rPr>
+        <w:t xml:space="preserve">Name: </w:t>
+      </w:r>
+      <w:r>
+        <w:rPr>
+          <w:sz w:val="24"/>
+          <w:szCs w:val="24"/>
+        </w:rPr>
+        <w:t>Purva Wankhede</w:t>
+      </w:r>
+    </w:p>
+    <w:p>
+      <w:pPr>
+        <w:pStyle w:val="ListParagraph"/>
+        <w:rPr>
+          <w:b/>
+          <w:bCs/>
+          <w:sz w:val="24"/>
+          <w:szCs w:val="24"/>
+        </w:rPr>
+      </w:pPr>
+      <w:r>
+        <w:rPr>
+          <w:b/>
+          <w:bCs/>
+          <w:sz w:val="24"/>
+          <w:szCs w:val="24"/>
+        </w:rPr>
+        <w:t xml:space="preserve">Batch: </w:t>
+      </w:r>
+      <w:r>
+        <w:rPr>
+          <w:sz w:val="24"/>
+          <w:szCs w:val="24"/>
+        </w:rPr>
+        <w:t>B1</w:t>
+      </w:r>
+    </w:p>
+    <w:p>
+      <w:pPr>
+        <w:pStyle w:val="ListParagraph"/>
+        <w:rPr>
+          <w:b/>
+          <w:bCs/>
+          <w:sz w:val="24"/>
+          <w:szCs w:val="24"/>
+        </w:rPr>
+      </w:pPr>
+      <w:r>
+        <w:rPr>
+          <w:b/>
+          <w:bCs/>
+          <w:sz w:val="24"/>
+          <w:szCs w:val="24"/>
+        </w:rPr>
+        <w:t xml:space="preserve">Date: </w:t>
+      </w:r>
+      <w:r>
+        <w:rPr>
+          <w:sz w:val="24"/>
+          <w:szCs w:val="24"/>
+        </w:rPr>
+        <w:t>19 Aug 2026</w:t>
+      </w:r>
     </w:p>
     <w:sectPr>
       <w:pgSz w:w="11906" w:h="16838"/>

</xml_diff>